<commit_message>
docs(E1.5): documento revisado e assinado
</commit_message>
<xml_diff>
--- a/documentos/ciclo-1/E1.5_Modelo conceitual _entidade-relacionamento_e_modelo_lógico_preliminar.docx
+++ b/documentos/ciclo-1/E1.5_Modelo conceitual _entidade-relacionamento_e_modelo_lógico_preliminar.docx
@@ -498,7 +498,7 @@
     <w:sdt>
       <w:sdtPr>
         <w:lock w:val="contentLocked"/>
-        <w:id w:val="-2037599315"/>
+        <w:id w:val="1990182846"/>
         <w:tag w:val="goog_rdk_0"/>
       </w:sdtPr>
       <w:sdtContent>
@@ -589,12 +589,12 @@
           <wp:inline distB="114300" distT="114300" distL="114300" distR="114300">
             <wp:extent cx="6840545" cy="3136900"/>
             <wp:effectExtent b="0" l="0" r="0" t="0"/>
-            <wp:docPr id="318" name="image3.png"/>
+            <wp:docPr id="320" name="image5.png"/>
             <a:graphic>
               <a:graphicData uri="http://schemas.openxmlformats.org/drawingml/2006/picture">
                 <pic:pic>
                   <pic:nvPicPr>
-                    <pic:cNvPr id="0" name="image3.png"/>
+                    <pic:cNvPr id="0" name="image5.png"/>
                     <pic:cNvPicPr preferRelativeResize="0"/>
                   </pic:nvPicPr>
                   <pic:blipFill>
@@ -743,7 +743,7 @@
     <w:sdt>
       <w:sdtPr>
         <w:lock w:val="contentLocked"/>
-        <w:id w:val="-1141487688"/>
+        <w:id w:val="-1828089338"/>
         <w:tag w:val="goog_rdk_1"/>
       </w:sdtPr>
       <w:sdtContent>
@@ -830,12 +830,12 @@
           <wp:inline distB="114300" distT="114300" distL="114300" distR="114300">
             <wp:extent cx="6840545" cy="5080000"/>
             <wp:effectExtent b="0" l="0" r="0" t="0"/>
-            <wp:docPr id="315" name="image5.png"/>
+            <wp:docPr id="315" name="image6.png"/>
             <a:graphic>
               <a:graphicData uri="http://schemas.openxmlformats.org/drawingml/2006/picture">
                 <pic:pic>
                   <pic:nvPicPr>
-                    <pic:cNvPr id="0" name="image5.png"/>
+                    <pic:cNvPr id="0" name="image6.png"/>
                     <pic:cNvPicPr preferRelativeResize="0"/>
                   </pic:nvPicPr>
                   <pic:blipFill>
@@ -1232,7 +1232,12 @@
           <w:szCs w:val="20"/>
           <w:rtl w:val="0"/>
         </w:rPr>
-        <w:t xml:space="preserve">Nome e assinatura</w:t>
+        <w:t xml:space="preserve">Ana Laura Almeida de Amorim</w:t>
+      </w:r>
+      <w:r>
+        <w:rPr>
+          <w:rtl w:val="0"/>
+        </w:rPr>
       </w:r>
     </w:p>
     <w:p>
@@ -1249,6 +1254,48 @@
         <w:rPr>
           <w:rtl w:val="0"/>
         </w:rPr>
+      </w:r>
+      <w:r>
+        <w:drawing>
+          <wp:anchor allowOverlap="1" behindDoc="1" distB="114300" distT="114300" distL="114300" distR="114300" hidden="0" layoutInCell="1" locked="0" relativeHeight="0" simplePos="0">
+            <wp:simplePos x="0" y="0"/>
+            <wp:positionH relativeFrom="column">
+              <wp:posOffset>647700</wp:posOffset>
+            </wp:positionH>
+            <wp:positionV relativeFrom="paragraph">
+              <wp:posOffset>155987</wp:posOffset>
+            </wp:positionV>
+            <wp:extent cx="4695825" cy="416481"/>
+            <wp:effectExtent b="0" l="0" r="0" t="0"/>
+            <wp:wrapNone/>
+            <wp:docPr id="319" name="image1.jpg"/>
+            <a:graphic>
+              <a:graphicData uri="http://schemas.openxmlformats.org/drawingml/2006/picture">
+                <pic:pic>
+                  <pic:nvPicPr>
+                    <pic:cNvPr id="0" name="image1.jpg"/>
+                    <pic:cNvPicPr preferRelativeResize="0"/>
+                  </pic:nvPicPr>
+                  <pic:blipFill>
+                    <a:blip r:embed="rId9"/>
+                    <a:srcRect b="70293" l="-5882" r="5882" t="13871"/>
+                    <a:stretch>
+                      <a:fillRect/>
+                    </a:stretch>
+                  </pic:blipFill>
+                  <pic:spPr>
+                    <a:xfrm>
+                      <a:off x="0" y="0"/>
+                      <a:ext cx="4695825" cy="416481"/>
+                    </a:xfrm>
+                    <a:prstGeom prst="rect"/>
+                    <a:ln/>
+                  </pic:spPr>
+                </pic:pic>
+              </a:graphicData>
+            </a:graphic>
+          </wp:anchor>
+        </w:drawing>
       </w:r>
     </w:p>
     <w:p>
@@ -1328,6 +1375,48 @@
         </w:rPr>
         <w:t xml:space="preserve">Nome e assinatura</w:t>
       </w:r>
+      <w:r>
+        <w:drawing>
+          <wp:anchor allowOverlap="1" behindDoc="1" distB="114300" distT="114300" distL="114300" distR="114300" hidden="0" layoutInCell="1" locked="0" relativeHeight="0" simplePos="0">
+            <wp:simplePos x="0" y="0"/>
+            <wp:positionH relativeFrom="column">
+              <wp:posOffset>962823</wp:posOffset>
+            </wp:positionH>
+            <wp:positionV relativeFrom="paragraph">
+              <wp:posOffset>171450</wp:posOffset>
+            </wp:positionV>
+            <wp:extent cx="4695825" cy="416481"/>
+            <wp:effectExtent b="0" l="0" r="0" t="0"/>
+            <wp:wrapNone/>
+            <wp:docPr id="318" name="image1.jpg"/>
+            <a:graphic>
+              <a:graphicData uri="http://schemas.openxmlformats.org/drawingml/2006/picture">
+                <pic:pic>
+                  <pic:nvPicPr>
+                    <pic:cNvPr id="0" name="image1.jpg"/>
+                    <pic:cNvPicPr preferRelativeResize="0"/>
+                  </pic:nvPicPr>
+                  <pic:blipFill>
+                    <a:blip r:embed="rId9"/>
+                    <a:srcRect b="49837" l="-11786" r="2157" t="32802"/>
+                    <a:stretch>
+                      <a:fillRect/>
+                    </a:stretch>
+                  </pic:blipFill>
+                  <pic:spPr>
+                    <a:xfrm>
+                      <a:off x="0" y="0"/>
+                      <a:ext cx="4695825" cy="416481"/>
+                    </a:xfrm>
+                    <a:prstGeom prst="rect"/>
+                    <a:ln/>
+                  </pic:spPr>
+                </pic:pic>
+              </a:graphicData>
+            </a:graphic>
+          </wp:anchor>
+        </w:drawing>
+      </w:r>
     </w:p>
     <w:p>
       <w:pPr>
@@ -1443,10 +1532,10 @@
       </w:r>
     </w:p>
     <w:sectPr>
-      <w:headerReference r:id="rId9" w:type="default"/>
-      <w:headerReference r:id="rId10" w:type="first"/>
-      <w:footerReference r:id="rId11" w:type="default"/>
-      <w:footerReference r:id="rId12" w:type="first"/>
+      <w:headerReference r:id="rId10" w:type="default"/>
+      <w:headerReference r:id="rId11" w:type="first"/>
+      <w:footerReference r:id="rId12" w:type="default"/>
+      <w:footerReference r:id="rId13" w:type="first"/>
       <w:pgSz w:h="16838" w:w="11906" w:orient="portrait"/>
       <w:pgMar w:bottom="1418" w:top="1559" w:left="567" w:right="566" w:header="709" w:footer="709"/>
       <w:pgNumType w:start="1"/>
@@ -1649,12 +1738,12 @@
               <wp:extent cx="7239645" cy="515620"/>
               <wp:effectExtent b="0" l="0" r="0" t="0"/>
               <wp:wrapNone/>
-              <wp:docPr id="309" name="image7.png"/>
+              <wp:docPr id="309" name="image8.png"/>
               <a:graphic>
                 <a:graphicData uri="http://schemas.openxmlformats.org/drawingml/2006/picture">
                   <pic:pic>
                     <pic:nvPicPr>
-                      <pic:cNvPr id="0" name="image7.png"/>
+                      <pic:cNvPr id="0" name="image8.png"/>
                       <pic:cNvPicPr preferRelativeResize="0"/>
                     </pic:nvPicPr>
                     <pic:blipFill>
@@ -1877,12 +1966,12 @@
               <wp:extent cx="7239635" cy="515620"/>
               <wp:effectExtent b="0" l="0" r="0" t="0"/>
               <wp:wrapNone/>
-              <wp:docPr id="310" name="image8.png"/>
+              <wp:docPr id="310" name="image9.png"/>
               <a:graphic>
                 <a:graphicData uri="http://schemas.openxmlformats.org/drawingml/2006/picture">
                   <pic:pic>
                     <pic:nvPicPr>
-                      <pic:cNvPr id="0" name="image8.png"/>
+                      <pic:cNvPr id="0" name="image9.png"/>
                       <pic:cNvPicPr preferRelativeResize="0"/>
                     </pic:nvPicPr>
                     <pic:blipFill>
@@ -2026,12 +2115,12 @@
               <wp:extent cx="7642860" cy="1283335"/>
               <wp:effectExtent b="0" l="0" r="0" t="0"/>
               <wp:wrapNone/>
-              <wp:docPr id="308" name="image6.png"/>
+              <wp:docPr id="308" name="image7.png"/>
               <a:graphic>
                 <a:graphicData uri="http://schemas.openxmlformats.org/drawingml/2006/picture">
                   <pic:pic>
                     <pic:nvPicPr>
-                      <pic:cNvPr id="0" name="image6.png"/>
+                      <pic:cNvPr id="0" name="image7.png"/>
                       <pic:cNvPicPr preferRelativeResize="0"/>
                     </pic:nvPicPr>
                     <pic:blipFill>
@@ -2135,12 +2224,12 @@
               <wp:extent cx="3292475" cy="787400"/>
               <wp:effectExtent b="0" l="0" r="0" t="0"/>
               <wp:wrapNone/>
-              <wp:docPr id="312" name="image10.png"/>
+              <wp:docPr id="312" name="image11.png"/>
               <a:graphic>
                 <a:graphicData uri="http://schemas.openxmlformats.org/drawingml/2006/picture">
                   <pic:pic>
                     <pic:nvPicPr>
-                      <pic:cNvPr id="0" name="image10.png"/>
+                      <pic:cNvPr id="0" name="image11.png"/>
                       <pic:cNvPicPr preferRelativeResize="0"/>
                     </pic:nvPicPr>
                     <pic:blipFill>
@@ -2280,12 +2369,12 @@
               <wp:extent cx="3286760" cy="809625"/>
               <wp:effectExtent b="0" l="0" r="0" t="0"/>
               <wp:wrapNone/>
-              <wp:docPr id="311" name="image9.png"/>
+              <wp:docPr id="311" name="image10.png"/>
               <a:graphic>
                 <a:graphicData uri="http://schemas.openxmlformats.org/drawingml/2006/picture">
                   <pic:pic>
                     <pic:nvPicPr>
-                      <pic:cNvPr id="0" name="image9.png"/>
+                      <pic:cNvPr id="0" name="image10.png"/>
                       <pic:cNvPicPr preferRelativeResize="0"/>
                     </pic:nvPicPr>
                     <pic:blipFill>
@@ -2324,12 +2413,12 @@
           <wp:extent cx="2933700" cy="506730"/>
           <wp:effectExtent b="0" l="0" r="0" t="0"/>
           <wp:wrapNone/>
-          <wp:docPr descr="Placa azul com letras brancas em fundo preto&#10;&#10;Descrição gerada automaticamente com confiança média" id="316" name="image2.png"/>
+          <wp:docPr descr="Placa azul com letras brancas em fundo preto&#10;&#10;Descrição gerada automaticamente com confiança média" id="316" name="image3.png"/>
           <a:graphic>
             <a:graphicData uri="http://schemas.openxmlformats.org/drawingml/2006/picture">
               <pic:pic>
                 <pic:nvPicPr>
-                  <pic:cNvPr descr="Placa azul com letras brancas em fundo preto&#10;&#10;Descrição gerada automaticamente com confiança média" id="0" name="image2.png"/>
+                  <pic:cNvPr descr="Placa azul com letras brancas em fundo preto&#10;&#10;Descrição gerada automaticamente com confiança média" id="0" name="image3.png"/>
                   <pic:cNvPicPr preferRelativeResize="0"/>
                 </pic:nvPicPr>
                 <pic:blipFill>
@@ -2627,12 +2716,12 @@
           <wp:extent cx="2108930" cy="383843"/>
           <wp:effectExtent b="0" l="0" r="0" t="0"/>
           <wp:wrapNone/>
-          <wp:docPr id="314" name="image1.png"/>
+          <wp:docPr id="314" name="image2.png"/>
           <a:graphic>
             <a:graphicData uri="http://schemas.openxmlformats.org/drawingml/2006/picture">
               <pic:pic>
                 <pic:nvPicPr>
-                  <pic:cNvPr id="0" name="image1.png"/>
+                  <pic:cNvPr id="0" name="image2.png"/>
                   <pic:cNvPicPr preferRelativeResize="0"/>
                 </pic:nvPicPr>
                 <pic:blipFill>

</xml_diff>